<commit_message>
Few tweaks to W6
</commit_message>
<xml_diff>
--- a/Workshops/Workshop 6 - Diagnosing LM with categorical predictors/Workshop-6---Diagnosing-LM-with-a-categorical-predictor--with-answers-.docx
+++ b/Workshops/Workshop 6 - Diagnosing LM with categorical predictors/Workshop-6---Diagnosing-LM-with-a-categorical-predictor--with-answers-.docx
@@ -101,7 +101,7 @@
         <w:t xml:space="preserve"> </w:t>
       </w:r>
       <w:r>
-        <w:t xml:space="preserve">2024-09-17</w:t>
+        <w:t xml:space="preserve">2024-09-18</w:t>
       </w:r>
     </w:p>
     <w:sdt>
@@ -780,7 +780,7 @@
       </w:r>
     </w:p>
     <w:bookmarkEnd w:id="24"/>
-    <w:bookmarkStart w:id="62" w:name="diagnosing"/>
+    <w:bookmarkStart w:id="65" w:name="diagnosing"/>
     <w:p>
       <w:pPr>
         <w:pStyle w:val="Heading1"/>
@@ -1231,7 +1231,34 @@
         <w:pStyle w:val="BodyText"/>
       </w:pPr>
       <w:r>
-        <w:t xml:space="preserve">What we’re looking for here is whether each category has broadly equal spread above and below a residual error of zero. The two lines you see here are the two groups. Remember that there was about a five gram difference between the island with mongoose and the one without, and we can see that here - when mongoose are absent the model predicts they should weigh about 269 g and when there are mongoose the model predicts rabbits weigh 266 g. In both groups, there are rabbits that weigh about 40 g more or less than the model expects, so it looks pretty good for meeting our assumption of equal variance of errors.</w:t>
+        <w:t xml:space="preserve">What we’re looking for here is whether each category (here where mongoose are</w:t>
+      </w:r>
+      <w:r>
+        <w:t xml:space="preserve"> </w:t>
+      </w:r>
+      <w:r>
+        <w:rPr>
+          <w:rStyle w:val="VerbatimChar"/>
+        </w:rPr>
+        <w:t xml:space="preserve">Present</w:t>
+      </w:r>
+      <w:r>
+        <w:t xml:space="preserve"> </w:t>
+      </w:r>
+      <w:r>
+        <w:t xml:space="preserve">or</w:t>
+      </w:r>
+      <w:r>
+        <w:t xml:space="preserve"> </w:t>
+      </w:r>
+      <w:r>
+        <w:rPr>
+          <w:rStyle w:val="VerbatimChar"/>
+        </w:rPr>
+        <w:t xml:space="preserve">Absent</w:t>
+      </w:r>
+      <w:r>
+        <w:t xml:space="preserve">) has broadly equal spread above and below a residual error of zero. The two lines you see here are the two groups. Remember that there was about a five gram difference between the island with mongoose and the one without, and we can see that here - when mongoose are absent the model predicts they should weigh about 269 g and when there are mongoose the model predicts rabbits weigh 266 g. In both groups, there are rabbits that weigh about 40 g more or less than the model expects, so it looks pretty good for meeting our assumption of equal variance of errors.</w:t>
       </w:r>
     </w:p>
     <w:p>
@@ -1257,7 +1284,7 @@
         <w:t xml:space="preserve"> </w:t>
       </w:r>
       <w:r>
-        <w:t xml:space="preserve">example look like? Well, consider the following example where the blue dots show the predicted response variable for groups A and B:</w:t>
+        <w:t xml:space="preserve">example look like? Well, consider the following example using a simulated dataset where the blue dots show the predicted response variable for groups A and B:</w:t>
       </w:r>
     </w:p>
     <w:p>
@@ -1447,12 +1474,38 @@
         <w:pStyle w:val="BodyText"/>
       </w:pPr>
       <w:r>
-        <w:t xml:space="preserve">We can see that the amount of uncertainty is equal in both groups, but in reality, the confidence intervals for Group A should probably be much smaller. This is the result of violating the assumption of equal variance of errors.</w:t>
+        <w:t xml:space="preserve">We can see that the amount of uncertainty (the 95% CI) is equal in both groups, but in reality, the confidence intervals for Group A should probably be much smaller. Keep in mind that inflated standard errors (which we use to calculate 95% CI) are a consequence of violating the assumption of equal variance of errors. However, the point estimate (the mean of groups A and B) are estimated accurately (which I only know for sure in this case because I simulated the data). So if we only cared about estimating the means of the groups accurately (and are not too concerned about uncertainty), then we wouldn’t be too worried about having unequal variance of errors.</w:t>
+      </w:r>
+    </w:p>
+    <w:p>
+      <w:pPr>
+        <w:pStyle w:val="BodyText"/>
+      </w:pPr>
+      <w:r>
+        <w:t xml:space="preserve">It’s worth saying that we generally do care about estimating uncertainty accurately. Keep in mind, we never really know if the means are</w:t>
+      </w:r>
+      <w:r>
+        <w:t xml:space="preserve"> </w:t>
+      </w:r>
+      <w:r>
+        <w:t xml:space="preserve">“</w:t>
+      </w:r>
+      <w:r>
+        <w:t xml:space="preserve">True</w:t>
+      </w:r>
+      <w:r>
+        <w:t xml:space="preserve">”</w:t>
+      </w:r>
+      <w:r>
+        <w:t xml:space="preserve"> </w:t>
+      </w:r>
+      <w:r>
+        <w:t xml:space="preserve">(as in they accurately reflect reality), so having some measure of uncertainty is generally the responsible approach to science. If you need a reminder of why it’s important, have a look at the lecture where we spoke about being given the option of two drugs with different probabilities of unintended mortality, and how our decision would change depending on if we showed uncertainty or not.</w:t>
       </w:r>
     </w:p>
     <w:bookmarkEnd w:id="44"/>
     <w:bookmarkEnd w:id="45"/>
-    <w:bookmarkStart w:id="49" w:name="scale-location"/>
+    <w:bookmarkStart w:id="52" w:name="scale-location"/>
     <w:p>
       <w:pPr>
         <w:pStyle w:val="Heading2"/>
@@ -1524,28 +1577,63 @@
         <w:pStyle w:val="BodyText"/>
       </w:pPr>
       <w:r>
-        <w:t xml:space="preserve">From the plot above, it seems like the assumption is maybe less well met than the Residuals vs Fitted plot would suggest, but it still looks good.</w:t>
-      </w:r>
-    </w:p>
-    <w:bookmarkEnd w:id="49"/>
-    <w:bookmarkStart w:id="53" w:name="q-q-residuals"/>
-    <w:p>
-      <w:pPr>
-        <w:pStyle w:val="Heading2"/>
-      </w:pPr>
+        <w:t xml:space="preserve">From the plot above, it seems like the assumption is very slightly less well met than the Residuals vs Fitted plot would suggest, simply because predictions at about 270 g seem to have residuals that are the tiniest bit larger than when the rabbits are predicted to weigh roughly 265 g (representing the mean predicted weights for our two mongoose categories,</w:t>
+      </w:r>
+      <w:r>
+        <w:t xml:space="preserve"> </w:t>
+      </w:r>
       <w:r>
         <w:rPr>
           <w:rStyle w:val="VerbatimChar"/>
         </w:rPr>
-        <w:t xml:space="preserve">Q-Q Residuals</w:t>
-      </w:r>
-    </w:p>
-    <w:p>
-      <w:pPr>
-        <w:pStyle w:val="FirstParagraph"/>
-      </w:pPr>
-      <w:r>
-        <w:t xml:space="preserve">Next to the Q-Q plot.</w:t>
+        <w:t xml:space="preserve">Present</w:t>
+      </w:r>
+      <w:r>
+        <w:t xml:space="preserve"> </w:t>
+      </w:r>
+      <w:r>
+        <w:t xml:space="preserve">and</w:t>
+      </w:r>
+      <w:r>
+        <w:t xml:space="preserve"> </w:t>
+      </w:r>
+      <w:r>
+        <w:rPr>
+          <w:rStyle w:val="VerbatimChar"/>
+        </w:rPr>
+        <w:t xml:space="preserve">Absent</w:t>
+      </w:r>
+      <w:r>
+        <w:t xml:space="preserve"> </w:t>
+      </w:r>
+      <w:r>
+        <w:t xml:space="preserve">respectively). Importantly though, this is no where near</w:t>
+      </w:r>
+      <w:r>
+        <w:t xml:space="preserve"> </w:t>
+      </w:r>
+      <w:r>
+        <w:t xml:space="preserve">“</w:t>
+      </w:r>
+      <w:r>
+        <w:t xml:space="preserve">substantial</w:t>
+      </w:r>
+      <w:r>
+        <w:t xml:space="preserve">”</w:t>
+      </w:r>
+      <w:r>
+        <w:t xml:space="preserve"> </w:t>
+      </w:r>
+      <w:r>
+        <w:t xml:space="preserve">enough for me to be worried about.</w:t>
+      </w:r>
+    </w:p>
+    <w:p>
+      <w:pPr>
+        <w:pStyle w:val="BodyText"/>
+      </w:pPr>
+      <w:r>
+        <w:t xml:space="preserve">For example, compare it to the data I simulated above that includes unequal variance of errors by design. Here’s what the Scale-Location plot looks like in that case:</w:t>
       </w:r>
     </w:p>
     <w:p>
@@ -1557,18 +1645,18 @@
           <wp:inline>
             <wp:extent cx="4620126" cy="3696101"/>
             <wp:effectExtent b="0" l="0" r="0" t="0"/>
-            <wp:docPr descr="" title="" id="51" name="Picture"/>
+            <wp:docPr descr="" title="" id="50" name="Picture"/>
             <a:graphic>
               <a:graphicData uri="http://schemas.openxmlformats.org/drawingml/2006/picture">
                 <pic:pic>
                   <pic:nvPicPr>
-                    <pic:cNvPr descr="Workshop-6---Diagnosing-LM-with-a-categorical-predictor--with-answers-_files/figure-docx/unnamed-chunk-10-1.png" id="52" name="Picture"/>
+                    <pic:cNvPr descr="Workshop-6---Diagnosing-LM-with-a-categorical-predictor--with-answers-_files/figure-docx/unnamed-chunk-10-1.png" id="51" name="Picture"/>
                     <pic:cNvPicPr>
                       <a:picLocks noChangeArrowheads="1" noChangeAspect="1"/>
                     </pic:cNvPicPr>
                   </pic:nvPicPr>
                   <pic:blipFill>
-                    <a:blip r:embed="rId50"/>
+                    <a:blip r:embed="rId49"/>
                     <a:stretch>
                       <a:fillRect/>
                     </a:stretch>
@@ -1595,106 +1683,8 @@
         </w:drawing>
       </w:r>
     </w:p>
-    <w:p>
-      <w:pPr>
-        <w:pStyle w:val="BodyText"/>
-      </w:pPr>
-      <w:r>
-        <w:t xml:space="preserve">Keep in mind that we’re assuming that the residuals of our model take on a</w:t>
-      </w:r>
-      <w:r>
-        <w:t xml:space="preserve"> </w:t>
-      </w:r>
-      <m:oMath>
-        <m:r>
-          <m:t>N</m:t>
-        </m:r>
-        <m:r>
-          <m:t>o</m:t>
-        </m:r>
-        <m:r>
-          <m:t>r</m:t>
-        </m:r>
-        <m:r>
-          <m:t>m</m:t>
-        </m:r>
-        <m:r>
-          <m:t>a</m:t>
-        </m:r>
-        <m:r>
-          <m:t>l</m:t>
-        </m:r>
-      </m:oMath>
-      <w:r>
-        <w:t xml:space="preserve"> </w:t>
-      </w:r>
-      <w:r>
-        <w:t xml:space="preserve">distribution, so that’s what this plot is looking for. What having</w:t>
-      </w:r>
-      <w:r>
-        <w:t xml:space="preserve"> </w:t>
-      </w:r>
-      <m:oMath>
-        <m:r>
-          <m:t>N</m:t>
-        </m:r>
-        <m:r>
-          <m:t>o</m:t>
-        </m:r>
-        <m:r>
-          <m:t>r</m:t>
-        </m:r>
-        <m:r>
-          <m:t>m</m:t>
-        </m:r>
-        <m:r>
-          <m:t>a</m:t>
-        </m:r>
-        <m:r>
-          <m:t>l</m:t>
-        </m:r>
-        <m:r>
-          <m:t>l</m:t>
-        </m:r>
-        <m:r>
-          <m:t>y</m:t>
-        </m:r>
-      </m:oMath>
-      <w:r>
-        <w:t xml:space="preserve"> </w:t>
-      </w:r>
-      <w:r>
-        <w:t xml:space="preserve">distributed residuals actually means, though, is whether or not our model is predicting the individual rabbits of our dataset accurately, which 99% of the time, we’re not too bothered about.</w:t>
-      </w:r>
-    </w:p>
-    <w:p>
-      <w:pPr>
-        <w:pStyle w:val="BodyText"/>
-      </w:pPr>
-      <w:r>
-        <w:t xml:space="preserve">Never-the-less, we still want the points to broadly lie on the dashed line, but we don’t stress out too much if it’s not perfect. If we ever did see utterly bizarre patterns in the points, that implies one of two things. Either you need to choose a different distribution for your data generating process and fit a</w:t>
-      </w:r>
-      <w:r>
-        <w:t xml:space="preserve"> </w:t>
-      </w:r>
-      <w:r>
-        <w:t xml:space="preserve">“</w:t>
-      </w:r>
-      <w:r>
-        <w:t xml:space="preserve">Generalised Linear Model</w:t>
-      </w:r>
-      <w:r>
-        <w:t xml:space="preserve">”</w:t>
-      </w:r>
-      <w:r>
-        <w:t xml:space="preserve"> </w:t>
-      </w:r>
-      <w:r>
-        <w:t xml:space="preserve">(GLM), or your model is missing some important predictor variables (more on both of these options later in the course).</w:t>
-      </w:r>
-    </w:p>
-    <w:bookmarkEnd w:id="53"/>
-    <w:bookmarkStart w:id="60" w:name="residuals-vs-leverage"/>
+    <w:bookmarkEnd w:id="52"/>
+    <w:bookmarkStart w:id="56" w:name="q-q-residuals"/>
     <w:p>
       <w:pPr>
         <w:pStyle w:val="Heading2"/>
@@ -1703,7 +1693,7 @@
         <w:rPr>
           <w:rStyle w:val="VerbatimChar"/>
         </w:rPr>
-        <w:t xml:space="preserve">Residuals vs Leverage</w:t>
+        <w:t xml:space="preserve">Q-Q Residuals</w:t>
       </w:r>
     </w:p>
     <w:p>
@@ -1711,7 +1701,7 @@
         <w:pStyle w:val="FirstParagraph"/>
       </w:pPr>
       <w:r>
-        <w:t xml:space="preserve">The last plot doesn’t assess the assumptions we’ve discussed but provides a different kind of insight. It helps identify disproportionately influential data points.</w:t>
+        <w:t xml:space="preserve">Next to the Q-Q plot for the rabbit model.</w:t>
       </w:r>
     </w:p>
     <w:p>
@@ -1723,18 +1713,18 @@
           <wp:inline>
             <wp:extent cx="4620126" cy="3696101"/>
             <wp:effectExtent b="0" l="0" r="0" t="0"/>
-            <wp:docPr descr="" title="" id="55" name="Picture"/>
+            <wp:docPr descr="" title="" id="54" name="Picture"/>
             <a:graphic>
               <a:graphicData uri="http://schemas.openxmlformats.org/drawingml/2006/picture">
                 <pic:pic>
                   <pic:nvPicPr>
-                    <pic:cNvPr descr="Workshop-6---Diagnosing-LM-with-a-categorical-predictor--with-answers-_files/figure-docx/unnamed-chunk-11-1.png" id="56" name="Picture"/>
+                    <pic:cNvPr descr="Workshop-6---Diagnosing-LM-with-a-categorical-predictor--with-answers-_files/figure-docx/unnamed-chunk-11-1.png" id="55" name="Picture"/>
                     <pic:cNvPicPr>
                       <a:picLocks noChangeArrowheads="1" noChangeAspect="1"/>
                     </pic:cNvPicPr>
                   </pic:nvPicPr>
                   <pic:blipFill>
-                    <a:blip r:embed="rId54"/>
+                    <a:blip r:embed="rId53"/>
                     <a:stretch>
                       <a:fillRect/>
                     </a:stretch>
@@ -1766,7 +1756,71 @@
         <w:pStyle w:val="BodyText"/>
       </w:pPr>
       <w:r>
-        <w:t xml:space="preserve">Just like last week, we’re looking to see if we can spot the contour lines indicating a Cook’s distance of 1. In the plot above, these contour lines are no-where in sight, so we don’t have any issues here either.</w:t>
+        <w:t xml:space="preserve">Keep in mind that we’re assuming that the residuals of our model take on a</w:t>
+      </w:r>
+      <w:r>
+        <w:t xml:space="preserve"> </w:t>
+      </w:r>
+      <m:oMath>
+        <m:r>
+          <m:t>N</m:t>
+        </m:r>
+        <m:r>
+          <m:t>o</m:t>
+        </m:r>
+        <m:r>
+          <m:t>r</m:t>
+        </m:r>
+        <m:r>
+          <m:t>m</m:t>
+        </m:r>
+        <m:r>
+          <m:t>a</m:t>
+        </m:r>
+        <m:r>
+          <m:t>l</m:t>
+        </m:r>
+      </m:oMath>
+      <w:r>
+        <w:t xml:space="preserve"> </w:t>
+      </w:r>
+      <w:r>
+        <w:t xml:space="preserve">distribution, so that’s what this plot is looking for. What having</w:t>
+      </w:r>
+      <w:r>
+        <w:t xml:space="preserve"> </w:t>
+      </w:r>
+      <m:oMath>
+        <m:r>
+          <m:t>N</m:t>
+        </m:r>
+        <m:r>
+          <m:t>o</m:t>
+        </m:r>
+        <m:r>
+          <m:t>r</m:t>
+        </m:r>
+        <m:r>
+          <m:t>m</m:t>
+        </m:r>
+        <m:r>
+          <m:t>a</m:t>
+        </m:r>
+        <m:r>
+          <m:t>l</m:t>
+        </m:r>
+        <m:r>
+          <m:t>l</m:t>
+        </m:r>
+        <m:r>
+          <m:t>y</m:t>
+        </m:r>
+      </m:oMath>
+      <w:r>
+        <w:t xml:space="preserve"> </w:t>
+      </w:r>
+      <w:r>
+        <w:t xml:space="preserve">distributed residuals actually means, though, is whether or not our model is predicting the individual rabbits of our dataset accurately, which 99% of the time, we’re not too bothered about.</w:t>
       </w:r>
     </w:p>
     <w:p>
@@ -1774,53 +1828,51 @@
         <w:pStyle w:val="BodyText"/>
       </w:pPr>
       <w:r>
-        <w:t xml:space="preserve">If you want an alternative way to check Cook’s distance, without showing Leverage, then you can do:</w:t>
-      </w:r>
-    </w:p>
-    <w:p>
-      <w:pPr>
-        <w:pStyle w:val="SourceCode"/>
-      </w:pPr>
-      <w:r>
-        <w:rPr>
-          <w:rStyle w:val="FunctionTok"/>
-        </w:rPr>
-        <w:t xml:space="preserve">plot</w:t>
-      </w:r>
-      <w:r>
-        <w:rPr>
-          <w:rStyle w:val="NormalTok"/>
-        </w:rPr>
-        <w:t xml:space="preserve">(rabbit_mod, </w:t>
-      </w:r>
-      <w:r>
-        <w:rPr>
-          <w:rStyle w:val="AttributeTok"/>
-        </w:rPr>
-        <w:t xml:space="preserve">which =</w:t>
-      </w:r>
-      <w:r>
-        <w:rPr>
-          <w:rStyle w:val="NormalTok"/>
-        </w:rPr>
-        <w:t xml:space="preserve"> </w:t>
-      </w:r>
-      <w:r>
-        <w:rPr>
-          <w:rStyle w:val="DecValTok"/>
-        </w:rPr>
-        <w:t xml:space="preserve">4</w:t>
-      </w:r>
-      <w:r>
-        <w:rPr>
-          <w:rStyle w:val="NormalTok"/>
-        </w:rPr>
-        <w:t xml:space="preserve">)</w:t>
+        <w:t xml:space="preserve">Never-the-less, we still want the points to broadly lie on the dashed line, but we don’t stress out too much if it’s not exactly perfect. If we ever did see utterly bizarre patterns in the points, that implies one of two things. Either you need to choose a different distribution for your data generating process and fit a</w:t>
+      </w:r>
+      <w:r>
+        <w:t xml:space="preserve"> </w:t>
+      </w:r>
+      <w:r>
+        <w:t xml:space="preserve">“</w:t>
+      </w:r>
+      <w:r>
+        <w:t xml:space="preserve">Generalised Linear Model</w:t>
+      </w:r>
+      <w:r>
+        <w:t xml:space="preserve">”</w:t>
+      </w:r>
+      <w:r>
+        <w:t xml:space="preserve"> </w:t>
+      </w:r>
+      <w:r>
+        <w:t xml:space="preserve">(GLM), or your model is missing some important predictor variables (more on both of these options later in the course).</w:t>
+      </w:r>
+    </w:p>
+    <w:bookmarkEnd w:id="56"/>
+    <w:bookmarkStart w:id="63" w:name="residuals-vs-leverage"/>
+    <w:p>
+      <w:pPr>
+        <w:pStyle w:val="Heading2"/>
+      </w:pPr>
+      <w:r>
+        <w:rPr>
+          <w:rStyle w:val="VerbatimChar"/>
+        </w:rPr>
+        <w:t xml:space="preserve">Residuals vs Leverage</w:t>
       </w:r>
     </w:p>
     <w:p>
       <w:pPr>
         <w:pStyle w:val="FirstParagraph"/>
+      </w:pPr>
+      <w:r>
+        <w:t xml:space="preserve">The last plot doesn’t assess the assumptions we’ve discussed but provides a different kind of insight. It helps identify disproportionately influential data points.</w:t>
+      </w:r>
+    </w:p>
+    <w:p>
+      <w:pPr>
+        <w:pStyle w:val="BodyText"/>
       </w:pPr>
       <w:r>
         <w:drawing>
@@ -1870,11 +1922,115 @@
         <w:pStyle w:val="BodyText"/>
       </w:pPr>
       <w:r>
+        <w:t xml:space="preserve">Just like last week, we’re looking to see if we can spot the contour lines indicating a Cook’s distance of 1. In the plot above, these contour lines are no-where in sight, so we don’t have any issues here either.</w:t>
+      </w:r>
+    </w:p>
+    <w:p>
+      <w:pPr>
+        <w:pStyle w:val="BodyText"/>
+      </w:pPr>
+      <w:r>
+        <w:t xml:space="preserve">If you want an alternative way to check Cook’s distance, without showing Leverage, then you can do:</w:t>
+      </w:r>
+    </w:p>
+    <w:p>
+      <w:pPr>
+        <w:pStyle w:val="SourceCode"/>
+      </w:pPr>
+      <w:r>
+        <w:rPr>
+          <w:rStyle w:val="FunctionTok"/>
+        </w:rPr>
+        <w:t xml:space="preserve">plot</w:t>
+      </w:r>
+      <w:r>
+        <w:rPr>
+          <w:rStyle w:val="NormalTok"/>
+        </w:rPr>
+        <w:t xml:space="preserve">(rabbit_mod, </w:t>
+      </w:r>
+      <w:r>
+        <w:rPr>
+          <w:rStyle w:val="AttributeTok"/>
+        </w:rPr>
+        <w:t xml:space="preserve">which =</w:t>
+      </w:r>
+      <w:r>
+        <w:rPr>
+          <w:rStyle w:val="NormalTok"/>
+        </w:rPr>
+        <w:t xml:space="preserve"> </w:t>
+      </w:r>
+      <w:r>
+        <w:rPr>
+          <w:rStyle w:val="DecValTok"/>
+        </w:rPr>
+        <w:t xml:space="preserve">4</w:t>
+      </w:r>
+      <w:r>
+        <w:rPr>
+          <w:rStyle w:val="NormalTok"/>
+        </w:rPr>
+        <w:t xml:space="preserve">)</w:t>
+      </w:r>
+    </w:p>
+    <w:p>
+      <w:pPr>
+        <w:pStyle w:val="FirstParagraph"/>
+      </w:pPr>
+      <w:r>
+        <w:drawing>
+          <wp:inline>
+            <wp:extent cx="4620126" cy="3696101"/>
+            <wp:effectExtent b="0" l="0" r="0" t="0"/>
+            <wp:docPr descr="" title="" id="61" name="Picture"/>
+            <a:graphic>
+              <a:graphicData uri="http://schemas.openxmlformats.org/drawingml/2006/picture">
+                <pic:pic>
+                  <pic:nvPicPr>
+                    <pic:cNvPr descr="Workshop-6---Diagnosing-LM-with-a-categorical-predictor--with-answers-_files/figure-docx/unnamed-chunk-13-1.png" id="62" name="Picture"/>
+                    <pic:cNvPicPr>
+                      <a:picLocks noChangeArrowheads="1" noChangeAspect="1"/>
+                    </pic:cNvPicPr>
+                  </pic:nvPicPr>
+                  <pic:blipFill>
+                    <a:blip r:embed="rId60"/>
+                    <a:stretch>
+                      <a:fillRect/>
+                    </a:stretch>
+                  </pic:blipFill>
+                  <pic:spPr bwMode="auto">
+                    <a:xfrm>
+                      <a:off x="0" y="0"/>
+                      <a:ext cx="4620126" cy="3696101"/>
+                    </a:xfrm>
+                    <a:prstGeom prst="rect">
+                      <a:avLst/>
+                    </a:prstGeom>
+                    <a:noFill/>
+                    <a:ln w="9525">
+                      <a:noFill/>
+                      <a:headEnd/>
+                      <a:tailEnd/>
+                    </a:ln>
+                  </pic:spPr>
+                </pic:pic>
+              </a:graphicData>
+            </a:graphic>
+          </wp:inline>
+        </w:drawing>
+      </w:r>
+    </w:p>
+    <w:p>
+      <w:pPr>
+        <w:pStyle w:val="BodyText"/>
+      </w:pPr>
+      <w:r>
         <w:t xml:space="preserve">None of our points are close to 1, so we don’t have any observations that are pulling our line one way or another.</w:t>
       </w:r>
     </w:p>
-    <w:bookmarkEnd w:id="60"/>
-    <w:bookmarkStart w:id="61" w:name="question-set-one"/>
+    <w:bookmarkEnd w:id="63"/>
+    <w:bookmarkStart w:id="64" w:name="question-set-one"/>
     <w:p>
       <w:pPr>
         <w:pStyle w:val="Heading2"/>
@@ -2021,9 +2177,9 @@
         <w:t xml:space="preserve"># No, it just means we have not found any issues related to a subset of our assumptions. Keep in mind that on Tuesday we were concerned about the validity of mongoose being absent on one of the islands. That's the biggest hurdle for this model, and these diagnostic plots don't help us at all with that.</w:t>
       </w:r>
     </w:p>
-    <w:bookmarkEnd w:id="61"/>
-    <w:bookmarkEnd w:id="62"/>
-    <w:bookmarkStart w:id="66" w:name="a-more-visually-appealing-alternative"/>
+    <w:bookmarkEnd w:id="64"/>
+    <w:bookmarkEnd w:id="65"/>
+    <w:bookmarkStart w:id="69" w:name="a-more-visually-appealing-alternative"/>
     <w:p>
       <w:pPr>
         <w:pStyle w:val="Heading1"/>
@@ -2124,18 +2280,18 @@
           <wp:inline>
             <wp:extent cx="5943600" cy="7132320"/>
             <wp:effectExtent b="0" l="0" r="0" t="0"/>
-            <wp:docPr descr="" title="" id="64" name="Picture"/>
+            <wp:docPr descr="" title="" id="67" name="Picture"/>
             <a:graphic>
               <a:graphicData uri="http://schemas.openxmlformats.org/drawingml/2006/picture">
                 <pic:pic>
                   <pic:nvPicPr>
-                    <pic:cNvPr descr="Workshop-6---Diagnosing-LM-with-a-categorical-predictor--with-answers-_files/figure-docx/unnamed-chunk-19-1.png" id="65" name="Picture"/>
+                    <pic:cNvPr descr="Workshop-6---Diagnosing-LM-with-a-categorical-predictor--with-answers-_files/figure-docx/unnamed-chunk-20-1.png" id="68" name="Picture"/>
                     <pic:cNvPicPr>
                       <a:picLocks noChangeArrowheads="1" noChangeAspect="1"/>
                     </pic:cNvPicPr>
                   </pic:nvPicPr>
                   <pic:blipFill>
-                    <a:blip r:embed="rId63"/>
+                    <a:blip r:embed="rId66"/>
                     <a:stretch>
                       <a:fillRect/>
                     </a:stretch>
@@ -2162,8 +2318,8 @@
         </w:drawing>
       </w:r>
     </w:p>
-    <w:bookmarkEnd w:id="66"/>
-    <w:bookmarkStart w:id="67" w:name="the-lemurs"/>
+    <w:bookmarkEnd w:id="69"/>
+    <w:bookmarkStart w:id="70" w:name="the-lemurs"/>
     <w:p>
       <w:pPr>
         <w:pStyle w:val="Heading1"/>
@@ -3471,8 +3627,8 @@
         <w:t xml:space="preserve"># No issues identified in EDA. Lemurs most active in rain forests and least in spiny forests. Could be interpreted as meaning rainforests are the preferred habitat, but could also imply this is just where they are most active (e.g. spend more time foraging for equivalent amount of food). Potential that this may be biased by how easy it is to record activity in different habitats but cannot confirm with data as is.</w:t>
       </w:r>
     </w:p>
-    <w:bookmarkEnd w:id="67"/>
-    <w:bookmarkStart w:id="68" w:name="assumption-table"/>
+    <w:bookmarkEnd w:id="70"/>
+    <w:bookmarkStart w:id="71" w:name="assumption-table"/>
     <w:p>
       <w:pPr>
         <w:pStyle w:val="Heading1"/>
@@ -3895,7 +4051,7 @@
         </w:tc>
       </w:tr>
     </w:tbl>
-    <w:bookmarkEnd w:id="68"/>
+    <w:bookmarkEnd w:id="71"/>
     <w:sectPr>
       <w:pgSz w:h="15840" w:w="12240"/>
       <w:pgMar w:bottom="1440" w:footer="720" w:gutter="0" w:header="720" w:left="1440" w:right="1440" w:top="1440"/>

</xml_diff>

<commit_message>
Corrections and updates to W6 and W7. Study notes for W6 created. Removed old versions of W7
</commit_message>
<xml_diff>
--- a/Workshops/Workshop 6 - Diagnosing LM with categorical predictors/Workshop-6---Diagnosing-LM-with-a-categorical-predictor--with-answers-.docx
+++ b/Workshops/Workshop 6 - Diagnosing LM with categorical predictors/Workshop-6---Diagnosing-LM-with-a-categorical-predictor--with-answers-.docx
@@ -101,7 +101,7 @@
         <w:t xml:space="preserve"> </w:t>
       </w:r>
       <w:r>
-        <w:t xml:space="preserve">2024-09-18</w:t>
+        <w:t xml:space="preserve">2025-08-25</w:t>
       </w:r>
     </w:p>
     <w:sdt>
@@ -1117,7 +1117,7 @@
         <w:pStyle w:val="FirstParagraph"/>
       </w:pPr>
       <w:r>
-        <w:t xml:space="preserve">One of the main differences from last week is that our model doesn’t have a linear trend - there’s no line that we can draw between mongoose being present and mongoose being absent. So we’re actually not assuming linearity here. One less thing to check for :).</w:t>
+        <w:t xml:space="preserve">One of the main differences from last week is that our model doesn’t have a linear trend - there’s no line that we can draw between mongoose being present and mongoose being absent. So there is no linear trend to meet the assumption of linearity. One less thing to check for :).</w:t>
       </w:r>
     </w:p>
     <w:bookmarkEnd w:id="31"/>
@@ -1474,7 +1474,7 @@
         <w:pStyle w:val="BodyText"/>
       </w:pPr>
       <w:r>
-        <w:t xml:space="preserve">We can see that the amount of uncertainty (the 95% CI) is equal in both groups, but in reality, the confidence intervals for Group A should probably be much smaller. Keep in mind that inflated standard errors (which we use to calculate 95% CI) are a consequence of violating the assumption of equal variance of errors. However, the point estimate (the mean of groups A and B) are estimated accurately (which I only know for sure in this case because I simulated the data). So if we only cared about estimating the means of the groups accurately (and are not too concerned about uncertainty), then we wouldn’t be too worried about having unequal variance of errors.</w:t>
+        <w:t xml:space="preserve">We can see that the amount of uncertainty (the 95% CI) is equal in both groups, but in reality, the confidence intervals for Group A should probably be much smaller. Keep in mind that inflated standard errors (which we use to calculate 95% CI) are a consequence of violating the assumption of equal variance of errors but it can just as easily lead to too small confidence intervals. However, the point estimate (the mean of groups A and B) are estimated accurately. So if we only cared about estimating the means of the groups accurately (and are not too concerned about uncertainty), then we wouldn’t be too worried about having unequal variance of errors.</w:t>
       </w:r>
     </w:p>
     <w:p>
@@ -1500,7 +1500,7 @@
         <w:t xml:space="preserve"> </w:t>
       </w:r>
       <w:r>
-        <w:t xml:space="preserve">(as in they accurately reflect reality), so having some measure of uncertainty is generally the responsible approach to science. If you need a reminder of why it’s important, have a look at the lecture where we spoke about being given the option of two drugs with different probabilities of unintended mortality, and how our decision would change depending on if we showed uncertainty or not.</w:t>
+        <w:t xml:space="preserve">(as in, they accurately reflect reality), so having some measure of uncertainty is generally the responsible approach to science. If you need a reminder of why it’s important, have a look at the lecture where we spoke about being given the option of two drugs with different probabilities of unintended mortality, and how our decision would change depending on if we showed uncertainty or not.</w:t>
       </w:r>
     </w:p>
     <w:bookmarkEnd w:id="44"/>
@@ -1607,7 +1607,7 @@
         <w:t xml:space="preserve"> </w:t>
       </w:r>
       <w:r>
-        <w:t xml:space="preserve">respectively). Importantly though, this is no where near</w:t>
+        <w:t xml:space="preserve">respectively). Importantly though, this is nowhere near</w:t>
       </w:r>
       <w:r>
         <w:t xml:space="preserve"> </w:t>
@@ -1820,7 +1820,33 @@
         <w:t xml:space="preserve"> </w:t>
       </w:r>
       <w:r>
-        <w:t xml:space="preserve">distributed residuals actually means, though, is whether or not our model is predicting the individual rabbits of our dataset accurately, which 99% of the time, we’re not too bothered about.</w:t>
+        <w:t xml:space="preserve">distributed residuals actually means, though, (aside from the residuals being approximately</w:t>
+      </w:r>
+      <w:r>
+        <w:t xml:space="preserve"> </w:t>
+      </w:r>
+      <m:oMath>
+        <m:r>
+          <m:t>N</m:t>
+        </m:r>
+        <m:r>
+          <m:t>o</m:t>
+        </m:r>
+        <m:r>
+          <m:t>r</m:t>
+        </m:r>
+        <m:r>
+          <m:t>m</m:t>
+        </m:r>
+        <m:r>
+          <m:t>a</m:t>
+        </m:r>
+        <m:r>
+          <m:t>l</m:t>
+        </m:r>
+      </m:oMath>
+      <w:r>
+        <w:t xml:space="preserve">) is whether or not our model is predicting the individual rabbits of our dataset accurately, which 99% of the time, we’re not too bothered about.</w:t>
       </w:r>
     </w:p>
     <w:p>
@@ -1922,7 +1948,7 @@
         <w:pStyle w:val="BodyText"/>
       </w:pPr>
       <w:r>
-        <w:t xml:space="preserve">Just like last week, we’re looking to see if we can spot the contour lines indicating a Cook’s distance of 1. In the plot above, these contour lines are no-where in sight, so we don’t have any issues here either.</w:t>
+        <w:t xml:space="preserve">Just like last week, we’re looking to see if we can spot the contour lines indicating a Cook’s distance of 1. In the plot above, these contour lines are nowhere in sight, so we don’t have any issues here either.</w:t>
       </w:r>
     </w:p>
     <w:p>
@@ -2071,7 +2097,7 @@
         <w:pStyle w:val="Compact"/>
       </w:pPr>
       <w:r>
-        <w:t xml:space="preserve">Which assumption(s) can be check for using the Scale-Location plot when fitting a linear model with only a categorical predictor variable?</w:t>
+        <w:t xml:space="preserve">Which assumption(s) can be checked for using the Scale-Location plot when fitting a linear model with only a categorical predictor variable?</w:t>
       </w:r>
     </w:p>
     <w:p>
@@ -2242,22 +2268,9 @@
         </w:rPr>
         <w:t xml:space="preserve">(performance)</w:t>
       </w:r>
-    </w:p>
-    <w:p>
-      <w:pPr>
-        <w:pStyle w:val="SourceCode"/>
-      </w:pPr>
-      <w:r>
-        <w:rPr>
-          <w:rStyle w:val="VerbatimChar"/>
-        </w:rPr>
-        <w:t xml:space="preserve">## Warning: package 'performance' was built under R version 4.3.3</w:t>
-      </w:r>
-    </w:p>
-    <w:p>
-      <w:pPr>
-        <w:pStyle w:val="SourceCode"/>
-      </w:pPr>
+      <w:r>
+        <w:br/>
+      </w:r>
       <w:r>
         <w:rPr>
           <w:rStyle w:val="FunctionTok"/>
@@ -4085,7 +4098,7 @@
 </file>
 
 <file path=word/numbering.xml><?xml version="1.0" encoding="utf-8"?>
-<w:numbering xmlns:aink="http://schemas.microsoft.com/office/drawing/2016/ink" xmlns:am3d="http://schemas.microsoft.com/office/drawing/2017/model3d" xmlns:cx="http://schemas.microsoft.com/office/drawing/2014/chartex" xmlns:cx1="http://schemas.microsoft.com/office/drawing/2015/9/8/chartex" xmlns:cx2="http://schemas.microsoft.com/office/drawing/2015/10/21/chartex" xmlns:cx3="http://schemas.microsoft.com/office/drawing/2016/5/9/chartex" xmlns:cx4="http://schemas.microsoft.com/office/drawing/2016/5/10/chartex" xmlns:cx5="http://schemas.microsoft.com/office/drawing/2016/5/11/chartex" xmlns:cx6="http://schemas.microsoft.com/office/drawing/2016/5/12/chartex" xmlns:cx7="http://schemas.microsoft.com/office/drawing/2016/5/13/chartex" xmlns:cx8="http://schemas.microsoft.com/office/drawing/2016/5/14/chartex" xmlns:m="http://schemas.openxmlformats.org/officeDocument/2006/math" xmlns:mc="http://schemas.openxmlformats.org/markup-compatibility/2006" xmlns:o="urn:schemas-microsoft-com:office:office" xmlns:oel="http://schemas.microsoft.com/office/2019/extlst" xmlns:r="http://schemas.openxmlformats.org/officeDocument/2006/relationships" xmlns:v="urn:schemas-microsoft-com:vml" xmlns:w="http://schemas.openxmlformats.org/wordprocessingml/2006/main" xmlns:w10="urn:schemas-microsoft-com:office:word" xmlns:w14="http://schemas.microsoft.com/office/word/2010/wordml" xmlns:w15="http://schemas.microsoft.com/office/word/2012/wordml" xmlns:w16="http://schemas.microsoft.com/office/word/2018/wordml" xmlns:w16cex="http://schemas.microsoft.com/office/word/2018/wordml/cex" xmlns:w16cid="http://schemas.microsoft.com/office/word/2016/wordml/cid" xmlns:w16du="http://schemas.microsoft.com/office/word/2023/wordml/word16du" xmlns:w16sdtdh="http://schemas.microsoft.com/office/word/2020/wordml/sdtdatahash" xmlns:w16se="http://schemas.microsoft.com/office/word/2015/wordml/symex" xmlns:wne="http://schemas.microsoft.com/office/word/2006/wordml" xmlns:wp="http://schemas.openxmlformats.org/drawingml/2006/wordprocessingDrawing" xmlns:wp14="http://schemas.microsoft.com/office/word/2010/wordprocessingDrawing" xmlns:wpc="http://schemas.microsoft.com/office/word/2010/wordprocessingCanvas" xmlns:wpg="http://schemas.microsoft.com/office/word/2010/wordprocessingGroup" xmlns:wpi="http://schemas.microsoft.com/office/word/2010/wordprocessingInk" xmlns:wps="http://schemas.microsoft.com/office/word/2010/wordprocessingShape" mc:Ignorable="w14 w15 w16se w16cid w16 w16cex w16sdtdh w16du wp14">
+<w:numbering xmlns:aink="http://schemas.microsoft.com/office/drawing/2016/ink" xmlns:am3d="http://schemas.microsoft.com/office/drawing/2017/model3d" xmlns:cx="http://schemas.microsoft.com/office/drawing/2014/chartex" xmlns:cx1="http://schemas.microsoft.com/office/drawing/2015/9/8/chartex" xmlns:cx2="http://schemas.microsoft.com/office/drawing/2015/10/21/chartex" xmlns:cx3="http://schemas.microsoft.com/office/drawing/2016/5/9/chartex" xmlns:cx4="http://schemas.microsoft.com/office/drawing/2016/5/10/chartex" xmlns:cx5="http://schemas.microsoft.com/office/drawing/2016/5/11/chartex" xmlns:cx6="http://schemas.microsoft.com/office/drawing/2016/5/12/chartex" xmlns:cx7="http://schemas.microsoft.com/office/drawing/2016/5/13/chartex" xmlns:cx8="http://schemas.microsoft.com/office/drawing/2016/5/14/chartex" xmlns:m="http://schemas.openxmlformats.org/officeDocument/2006/math" xmlns:mc="http://schemas.openxmlformats.org/markup-compatibility/2006" xmlns:o="urn:schemas-microsoft-com:office:office" xmlns:oel="http://schemas.microsoft.com/office/2019/extlst" xmlns:r="http://schemas.openxmlformats.org/officeDocument/2006/relationships" xmlns:v="urn:schemas-microsoft-com:vml" xmlns:w="http://schemas.openxmlformats.org/wordprocessingml/2006/main" xmlns:w10="urn:schemas-microsoft-com:office:word" xmlns:w14="http://schemas.microsoft.com/office/word/2010/wordml" xmlns:w15="http://schemas.microsoft.com/office/word/2012/wordml" xmlns:w16="http://schemas.microsoft.com/office/word/2018/wordml" xmlns:w16cex="http://schemas.microsoft.com/office/word/2018/wordml/cex" xmlns:w16cid="http://schemas.microsoft.com/office/word/2016/wordml/cid" xmlns:w16du="http://schemas.microsoft.com/office/word/2023/wordml/word16du" xmlns:w16sdtdh="http://schemas.microsoft.com/office/word/2020/wordml/sdtdatahash" xmlns:w16sdtfl="http://schemas.microsoft.com/office/word/2024/wordml/sdtformatlock" xmlns:w16se="http://schemas.microsoft.com/office/word/2015/wordml/symex" xmlns:wne="http://schemas.microsoft.com/office/word/2006/wordml" xmlns:wp="http://schemas.openxmlformats.org/drawingml/2006/wordprocessingDrawing" xmlns:wp14="http://schemas.microsoft.com/office/word/2010/wordprocessingDrawing" xmlns:wpc="http://schemas.microsoft.com/office/word/2010/wordprocessingCanvas" xmlns:wpg="http://schemas.microsoft.com/office/word/2010/wordprocessingGroup" xmlns:wpi="http://schemas.microsoft.com/office/word/2010/wordprocessingInk" xmlns:wps="http://schemas.microsoft.com/office/word/2010/wordprocessingShape" mc:Ignorable="w14 w15 w16se w16cid w16 w16cex w16sdtdh w16sdtfl w16du wp14">
   <w:abstractNum w15:restartNumberingAfterBreak="0" w:abstractNumId="0">
     <w:nsid w:val="0000A990"/>
     <w:multiLevelType w:val="multilevel"/>
@@ -5165,7 +5178,7 @@
 </file>
 
 <file path=word/styles.xml><?xml version="1.0" encoding="utf-8"?>
-<w:styles xmlns:mc="http://schemas.openxmlformats.org/markup-compatibility/2006" xmlns:r="http://schemas.openxmlformats.org/officeDocument/2006/relationships" xmlns:w="http://schemas.openxmlformats.org/wordprocessingml/2006/main" xmlns:w14="http://schemas.microsoft.com/office/word/2010/wordml" xmlns:w15="http://schemas.microsoft.com/office/word/2012/wordml" xmlns:w16="http://schemas.microsoft.com/office/word/2018/wordml" xmlns:w16cex="http://schemas.microsoft.com/office/word/2018/wordml/cex" xmlns:w16cid="http://schemas.microsoft.com/office/word/2016/wordml/cid" xmlns:w16du="http://schemas.microsoft.com/office/word/2023/wordml/word16du" xmlns:w16sdtdh="http://schemas.microsoft.com/office/word/2020/wordml/sdtdatahash" xmlns:w16se="http://schemas.microsoft.com/office/word/2015/wordml/symex" mc:Ignorable="w14 w15 w16se w16cid w16 w16cex w16sdtdh w16du">
+<w:styles xmlns:mc="http://schemas.openxmlformats.org/markup-compatibility/2006" xmlns:r="http://schemas.openxmlformats.org/officeDocument/2006/relationships" xmlns:w="http://schemas.openxmlformats.org/wordprocessingml/2006/main" xmlns:w14="http://schemas.microsoft.com/office/word/2010/wordml" xmlns:w15="http://schemas.microsoft.com/office/word/2012/wordml" xmlns:w16="http://schemas.microsoft.com/office/word/2018/wordml" xmlns:w16cex="http://schemas.microsoft.com/office/word/2018/wordml/cex" xmlns:w16cid="http://schemas.microsoft.com/office/word/2016/wordml/cid" xmlns:w16du="http://schemas.microsoft.com/office/word/2023/wordml/word16du" xmlns:w16sdtdh="http://schemas.microsoft.com/office/word/2020/wordml/sdtdatahash" xmlns:w16sdtfl="http://schemas.microsoft.com/office/word/2024/wordml/sdtformatlock" xmlns:w16se="http://schemas.microsoft.com/office/word/2015/wordml/symex" mc:Ignorable="w14 w15 w16se w16cid w16 w16cex w16sdtdh w16sdtfl w16du">
   <w:docDefaults>
     <w:rPrDefault>
       <w:rPr>
@@ -5859,9 +5872,10 @@
     <w:name w:val="Verbatim Char"/>
     <w:basedOn w:val="CaptionChar"/>
     <w:link w:val="SourceCode"/>
-    <w:rsid w:val="00F34E30"/>
+    <w:rsid w:val="00796E50"/>
     <w:rPr>
       <w:rFonts w:ascii="Consolas" w:hAnsi="Consolas"/>
+      <w:sz w:val="22"/>
       <w:shd w:color="auto" w:fill="F8F8F8" w:val="clear"/>
     </w:rPr>
   </w:style>
@@ -5906,10 +5920,11 @@
     <w:name w:val="Source Code"/>
     <w:basedOn w:val="Normal"/>
     <w:link w:val="VerbatimChar"/>
-    <w:rsid w:val="00F34E30"/>
+    <w:rsid w:val="00796E50"/>
     <w:pPr>
       <w:shd w:color="auto" w:fill="F8F8F8" w:val="clear"/>
       <w:wordWrap w:val="0"/>
+      <w:textboxTightWrap w:val="allLines"/>
     </w:pPr>
     <w:rPr>
       <w:rFonts w:ascii="Consolas" w:hAnsi="Consolas"/>
@@ -5922,6 +5937,7 @@
       <w:rFonts w:ascii="Consolas" w:hAnsi="Consolas"/>
       <w:b/>
       <w:color w:val="204A87"/>
+      <w:sz w:val="22"/>
       <w:shd w:color="auto" w:fill="F8F8F8" w:val="clear"/>
     </w:rPr>
   </w:style>
@@ -5931,6 +5947,7 @@
     <w:rPr>
       <w:rFonts w:ascii="Consolas" w:hAnsi="Consolas"/>
       <w:color w:val="204A87"/>
+      <w:sz w:val="22"/>
       <w:shd w:color="auto" w:fill="F8F8F8" w:val="clear"/>
     </w:rPr>
   </w:style>
@@ -5940,6 +5957,7 @@
     <w:rPr>
       <w:rFonts w:ascii="Consolas" w:hAnsi="Consolas"/>
       <w:color w:val="0000CF"/>
+      <w:sz w:val="22"/>
       <w:shd w:color="auto" w:fill="F8F8F8" w:val="clear"/>
     </w:rPr>
   </w:style>
@@ -5949,6 +5967,7 @@
     <w:rPr>
       <w:rFonts w:ascii="Consolas" w:hAnsi="Consolas"/>
       <w:color w:val="0000CF"/>
+      <w:sz w:val="22"/>
       <w:shd w:color="auto" w:fill="F8F8F8" w:val="clear"/>
     </w:rPr>
   </w:style>
@@ -5958,6 +5977,7 @@
     <w:rPr>
       <w:rFonts w:ascii="Consolas" w:hAnsi="Consolas"/>
       <w:color w:val="0000CF"/>
+      <w:sz w:val="22"/>
       <w:shd w:color="auto" w:fill="F8F8F8" w:val="clear"/>
     </w:rPr>
   </w:style>
@@ -5968,6 +5988,7 @@
     <w:rPr>
       <w:rFonts w:ascii="Consolas" w:hAnsi="Consolas"/>
       <w:color w:themeColor="accent2" w:themeShade="BF" w:val="943634"/>
+      <w:sz w:val="22"/>
       <w:shd w:color="auto" w:fill="F8F8F8" w:val="clear"/>
     </w:rPr>
   </w:style>
@@ -5977,6 +5998,7 @@
     <w:rPr>
       <w:rFonts w:ascii="Consolas" w:hAnsi="Consolas"/>
       <w:color w:val="4E9A06"/>
+      <w:sz w:val="22"/>
       <w:shd w:color="auto" w:fill="F8F8F8" w:val="clear"/>
     </w:rPr>
   </w:style>
@@ -5987,6 +6009,7 @@
       <w:rFonts w:ascii="Consolas" w:hAnsi="Consolas"/>
       <w:b/>
       <w:color w:val="CE5C00"/>
+      <w:sz w:val="22"/>
       <w:shd w:color="auto" w:fill="F8F8F8" w:val="clear"/>
     </w:rPr>
   </w:style>
@@ -5996,6 +6019,7 @@
     <w:rPr>
       <w:rFonts w:ascii="Consolas" w:hAnsi="Consolas"/>
       <w:color w:val="4E9A06"/>
+      <w:sz w:val="22"/>
       <w:shd w:color="auto" w:fill="F8F8F8" w:val="clear"/>
     </w:rPr>
   </w:style>
@@ -6005,6 +6029,7 @@
     <w:rPr>
       <w:rFonts w:ascii="Consolas" w:hAnsi="Consolas"/>
       <w:color w:val="4E9A06"/>
+      <w:sz w:val="22"/>
       <w:shd w:color="auto" w:fill="F8F8F8" w:val="clear"/>
     </w:rPr>
   </w:style>
@@ -6014,6 +6039,7 @@
     <w:rPr>
       <w:rFonts w:ascii="Consolas" w:hAnsi="Consolas"/>
       <w:color w:val="4E9A06"/>
+      <w:sz w:val="22"/>
       <w:shd w:color="auto" w:fill="F8F8F8" w:val="clear"/>
     </w:rPr>
   </w:style>
@@ -6022,6 +6048,7 @@
     <w:basedOn w:val="VerbatimChar"/>
     <w:rPr>
       <w:rFonts w:ascii="Consolas" w:hAnsi="Consolas"/>
+      <w:sz w:val="22"/>
       <w:shd w:color="auto" w:fill="F8F8F8" w:val="clear"/>
     </w:rPr>
   </w:style>
@@ -6033,6 +6060,7 @@
       <w:rFonts w:ascii="Consolas" w:hAnsi="Consolas"/>
       <w:i/>
       <w:color w:themeColor="accent4" w:themeTint="99" w:val="B2A1C7"/>
+      <w:sz w:val="22"/>
       <w:shd w:color="auto" w:fill="F8F8F8" w:val="clear"/>
     </w:rPr>
   </w:style>
@@ -6044,6 +6072,7 @@
       <w:b/>
       <w:i/>
       <w:color w:val="8F5902"/>
+      <w:sz w:val="22"/>
       <w:shd w:color="auto" w:fill="F8F8F8" w:val="clear"/>
     </w:rPr>
   </w:style>
@@ -6055,6 +6084,7 @@
       <w:b/>
       <w:i/>
       <w:color w:val="8F5902"/>
+      <w:sz w:val="22"/>
       <w:shd w:color="auto" w:fill="F8F8F8" w:val="clear"/>
     </w:rPr>
   </w:style>
@@ -6066,6 +6096,7 @@
       <w:b/>
       <w:i/>
       <w:color w:val="8F5902"/>
+      <w:sz w:val="22"/>
       <w:shd w:color="auto" w:fill="F8F8F8" w:val="clear"/>
     </w:rPr>
   </w:style>
@@ -6075,6 +6106,7 @@
     <w:rPr>
       <w:rFonts w:ascii="Consolas" w:hAnsi="Consolas"/>
       <w:color w:val="8F5902"/>
+      <w:sz w:val="22"/>
       <w:shd w:color="auto" w:fill="F8F8F8" w:val="clear"/>
     </w:rPr>
   </w:style>
@@ -6086,6 +6118,7 @@
       <w:rFonts w:ascii="Consolas" w:hAnsi="Consolas"/>
       <w:b/>
       <w:color w:themeColor="accent6" w:val="F79646"/>
+      <w:sz w:val="22"/>
       <w:shd w:color="auto" w:fill="F8F8F8" w:val="clear"/>
     </w:rPr>
   </w:style>
@@ -6095,6 +6128,7 @@
     <w:rPr>
       <w:rFonts w:ascii="Consolas" w:hAnsi="Consolas"/>
       <w:color w:val="000000"/>
+      <w:sz w:val="22"/>
       <w:shd w:color="auto" w:fill="F8F8F8" w:val="clear"/>
     </w:rPr>
   </w:style>
@@ -6105,6 +6139,7 @@
       <w:rFonts w:ascii="Consolas" w:hAnsi="Consolas"/>
       <w:b/>
       <w:color w:val="204A87"/>
+      <w:sz w:val="22"/>
       <w:shd w:color="auto" w:fill="F8F8F8" w:val="clear"/>
     </w:rPr>
   </w:style>
@@ -6115,6 +6150,7 @@
       <w:rFonts w:ascii="Consolas" w:hAnsi="Consolas"/>
       <w:b/>
       <w:color w:val="CE5C00"/>
+      <w:sz w:val="22"/>
       <w:shd w:color="auto" w:fill="F8F8F8" w:val="clear"/>
     </w:rPr>
   </w:style>
@@ -6123,6 +6159,7 @@
     <w:basedOn w:val="VerbatimChar"/>
     <w:rPr>
       <w:rFonts w:ascii="Consolas" w:hAnsi="Consolas"/>
+      <w:sz w:val="22"/>
       <w:shd w:color="auto" w:fill="F8F8F8" w:val="clear"/>
     </w:rPr>
   </w:style>
@@ -6131,6 +6168,7 @@
     <w:basedOn w:val="VerbatimChar"/>
     <w:rPr>
       <w:rFonts w:ascii="Consolas" w:hAnsi="Consolas"/>
+      <w:sz w:val="22"/>
       <w:shd w:color="auto" w:fill="F8F8F8" w:val="clear"/>
     </w:rPr>
   </w:style>
@@ -6141,6 +6179,7 @@
       <w:rFonts w:ascii="Consolas" w:hAnsi="Consolas"/>
       <w:i/>
       <w:color w:val="8F5902"/>
+      <w:sz w:val="22"/>
       <w:shd w:color="auto" w:fill="F8F8F8" w:val="clear"/>
     </w:rPr>
   </w:style>
@@ -6150,6 +6189,7 @@
     <w:rPr>
       <w:rFonts w:ascii="Consolas" w:hAnsi="Consolas"/>
       <w:color w:val="204A87"/>
+      <w:sz w:val="22"/>
       <w:shd w:color="auto" w:fill="F8F8F8" w:val="clear"/>
     </w:rPr>
   </w:style>
@@ -6158,6 +6198,7 @@
     <w:basedOn w:val="VerbatimChar"/>
     <w:rPr>
       <w:rFonts w:ascii="Consolas" w:hAnsi="Consolas"/>
+      <w:sz w:val="22"/>
       <w:shd w:color="auto" w:fill="F8F8F8" w:val="clear"/>
     </w:rPr>
   </w:style>
@@ -6169,6 +6210,7 @@
       <w:b/>
       <w:i/>
       <w:color w:val="8F5902"/>
+      <w:sz w:val="22"/>
       <w:shd w:color="auto" w:fill="F8F8F8" w:val="clear"/>
     </w:rPr>
   </w:style>
@@ -6180,6 +6222,7 @@
       <w:b/>
       <w:i/>
       <w:color w:val="8F5902"/>
+      <w:sz w:val="22"/>
       <w:shd w:color="auto" w:fill="F8F8F8" w:val="clear"/>
     </w:rPr>
   </w:style>
@@ -6189,6 +6232,7 @@
     <w:rPr>
       <w:rFonts w:ascii="Consolas" w:hAnsi="Consolas"/>
       <w:color w:val="EF2929"/>
+      <w:sz w:val="22"/>
       <w:shd w:color="auto" w:fill="F8F8F8" w:val="clear"/>
     </w:rPr>
   </w:style>
@@ -6199,6 +6243,7 @@
       <w:rFonts w:ascii="Consolas" w:hAnsi="Consolas"/>
       <w:b/>
       <w:color w:val="A40000"/>
+      <w:sz w:val="22"/>
       <w:shd w:color="auto" w:fill="F8F8F8" w:val="clear"/>
     </w:rPr>
   </w:style>
@@ -6209,6 +6254,7 @@
     <w:rPr>
       <w:rFonts w:ascii="Consolas" w:hAnsi="Consolas"/>
       <w:color w:themeColor="text1" w:themeTint="F2" w:val="0D0D0D"/>
+      <w:sz w:val="22"/>
       <w:shd w:color="auto" w:fill="F8F8F8" w:val="clear"/>
     </w:rPr>
   </w:style>

</xml_diff>